<commit_message>
Mask AWS account ID in capstone documentation
Replace the 12-digit account ID with xxxxxxxxxxxx throughout the Word
document, including inside ARNs and the ECR repository URI, so the ARN
shape stays readable.
</commit_message>
<xml_diff>
--- a/docs/Capstone-Full-Documentation.docx
+++ b/docs/Capstone-Full-Documentation.docx
@@ -450,7 +450,7 @@
           <w:spacing w:val="0"/>
           <w:color w:val="121822"/>
         </w:rPr>
-        <w:t xml:space="preserve">868962733067</w:t>
+        <w:t xml:space="preserve">xxxxxxxxxxxx</w:t>
       </w:r>
       <w:r>
         <w:rPr>
@@ -1718,7 +1718,7 @@
           <w:spacing w:val="0"/>
           <w:color w:val="121822"/>
         </w:rPr>
-        <w:t xml:space="preserve">arn:aws:sts::868962733067:assumed-role/mokoml/mokoml-Isengard</w:t>
+        <w:t xml:space="preserve">arn:aws:sts::xxxxxxxxxxxx:assumed-role/mokoml/mokoml-Isengard</w:t>
       </w:r>
       <w:r>
         <w:rPr>
@@ -2103,7 +2103,7 @@
           <w:spacing w:val="0"/>
           <w:color w:val="121822"/>
         </w:rPr>
-        <w:t xml:space="preserve">‹paste finch version + vm status = Running + caller-identity account 868962733067›</w:t>
+        <w:t xml:space="preserve">‹paste finch version + vm status = Running + caller-identity account xxxxxxxxxxxx›</w:t>
       </w:r>
     </w:p>
     <w:p>
@@ -3165,7 +3165,7 @@
           <w:spacing w:val="0"/>
           <w:color w:val="121822"/>
         </w:rPr>
-        <w:t xml:space="preserve">  → repositoryUri: 868962733067.dkr.ecr.us-east-1.amazonaws.com/intern-dashboard</w:t>
+        <w:t xml:space="preserve">  → repositoryUri: xxxxxxxxxxxx.dkr.ecr.us-east-1.amazonaws.com/intern-dashboard</w:t>
       </w:r>
     </w:p>
     <w:p>
@@ -4484,33 +4484,33 @@
           <w:spacing w:val="0"/>
           <w:color w:val="121822"/>
         </w:rPr>
-        <w:t xml:space="preserve">          arn:aws:dynamodb:us-east-1:868962733067:table/intern-dashboard-progress</w:t>
-      </w:r>
-    </w:p>
-    <w:p>
-      <w:pPr/>
-      <w:r>
-        <w:rPr>
-          <w:rFonts w:ascii="Menlo" w:hAnsi="Menlo" w:cs="Menlo"/>
-          <w:sz w:val="25"/>
-          <w:sz-cs w:val="25"/>
-          <w:spacing w:val="0"/>
-          <w:color w:val="121822"/>
-        </w:rPr>
-        <w:t xml:space="preserve">Execution role: arn:aws:iam::868962733067:role/ecsTaskExecutionRole (already existed)</w:t>
-      </w:r>
-    </w:p>
-    <w:p>
-      <w:pPr/>
-      <w:r>
-        <w:rPr>
-          <w:rFonts w:ascii="Menlo" w:hAnsi="Menlo" w:cs="Menlo"/>
-          <w:sz w:val="25"/>
-          <w:sz-cs w:val="25"/>
-          <w:spacing w:val="0"/>
-          <w:color w:val="121822"/>
-        </w:rPr>
-        <w:t xml:space="preserve">Task role:      arn:aws:iam::868962733067:role/intern-dashboard-task-role</w:t>
+        <w:t xml:space="preserve">          arn:aws:dynamodb:us-east-1:xxxxxxxxxxxx:table/intern-dashboard-progress</w:t>
+      </w:r>
+    </w:p>
+    <w:p>
+      <w:pPr/>
+      <w:r>
+        <w:rPr>
+          <w:rFonts w:ascii="Menlo" w:hAnsi="Menlo" w:cs="Menlo"/>
+          <w:sz w:val="25"/>
+          <w:sz-cs w:val="25"/>
+          <w:spacing w:val="0"/>
+          <w:color w:val="121822"/>
+        </w:rPr>
+        <w:t xml:space="preserve">Execution role: arn:aws:iam::xxxxxxxxxxxx:role/ecsTaskExecutionRole (already existed)</w:t>
+      </w:r>
+    </w:p>
+    <w:p>
+      <w:pPr/>
+      <w:r>
+        <w:rPr>
+          <w:rFonts w:ascii="Menlo" w:hAnsi="Menlo" w:cs="Menlo"/>
+          <w:sz w:val="25"/>
+          <w:sz-cs w:val="25"/>
+          <w:spacing w:val="0"/>
+          <w:color w:val="121822"/>
+        </w:rPr>
+        <w:t xml:space="preserve">Task role:      arn:aws:iam::xxxxxxxxxxxx:role/intern-dashboard-task-role</w:t>
       </w:r>
     </w:p>
     <w:p>

</xml_diff>